<commit_message>
docs: correct company name to TestResults in technical doc
</commit_message>
<xml_diff>
--- a/docs/Newsletter-Component-Technical-Documentation.docx
+++ b/docs/Newsletter-Component-Technical-Documentation.docx
@@ -84,7 +84,7 @@
           <w:sz w:val="20"/>
           <w:szCs w:val="20"/>
         </w:rPr>
-        <w:t>Frontend Technical Challenge — Progile</w:t>
+        <w:t>Frontend Technical Challenge — TestResults</w:t>
       </w:r>
     </w:p>
     <w:p>
@@ -322,19 +322,8 @@
                   <w:szCs w:val="20"/>
                   <w:lang w:val="en-NZ"/>
                 </w:rPr>
-                <w:t>newsletter-subscription-</w:t>
+                <w:t>newsletter-subscription-component.vercel.app</w:t>
               </w:r>
-              <w:proofErr w:type="spellStart"/>
-              <w:r>
-                <w:rPr>
-                  <w:rStyle w:val="Hipervnculo"/>
-                  <w:sz w:val="20"/>
-                  <w:szCs w:val="20"/>
-                  <w:lang w:val="en-NZ"/>
-                </w:rPr>
-                <w:t>component.vercel.app</w:t>
-              </w:r>
-              <w:proofErr w:type="spellEnd"/>
             </w:hyperlink>
             <w:r>
               <w:rPr>
@@ -367,7 +356,6 @@
             </w:tcMar>
           </w:tcPr>
           <w:p>
-            <w:proofErr w:type="gramStart"/>
             <w:r>
               <w:rPr>
                 <w:color w:val="0A0A0A"/>
@@ -376,7 +364,6 @@
               </w:rPr>
               <w:t>Visual editor</w:t>
             </w:r>
-            <w:proofErr w:type="gramEnd"/>
           </w:p>
         </w:tc>
         <w:tc>
@@ -410,27 +397,7 @@
                   <w:szCs w:val="20"/>
                   <w:lang w:val="en-NZ"/>
                 </w:rPr>
-                <w:t>newsletter-subscription-</w:t>
-              </w:r>
-              <w:proofErr w:type="spellStart"/>
-              <w:r>
-                <w:rPr>
-                  <w:rStyle w:val="Hipervnculo"/>
-                  <w:sz w:val="20"/>
-                  <w:szCs w:val="20"/>
-                  <w:lang w:val="en-NZ"/>
-                </w:rPr>
-                <w:t>component.vercel.app</w:t>
-              </w:r>
-              <w:proofErr w:type="spellEnd"/>
-              <w:r>
-                <w:rPr>
-                  <w:rStyle w:val="Hipervnculo"/>
-                  <w:sz w:val="20"/>
-                  <w:szCs w:val="20"/>
-                  <w:lang w:val="en-NZ"/>
-                </w:rPr>
-                <w:t>/admin</w:t>
+                <w:t>newsletter-subscription-component.vercel.app/admin</w:t>
               </w:r>
             </w:hyperlink>
             <w:r>
@@ -516,11 +483,7 @@
           </w:pPr>
           <w:r>
             <w:fldChar w:fldCharType="begin"/>
-          </w:r>
-          <w:r>
             <w:instrText xml:space="preserve"> TOC \o "1-3" \h \z \u </w:instrText>
-          </w:r>
-          <w:r>
             <w:fldChar w:fldCharType="separate"/>
           </w:r>
           <w:hyperlink w:anchor="_Toc233395654" w:history="1">
@@ -538,46 +501,10 @@
                 <w:webHidden/>
               </w:rPr>
               <w:tab/>
-            </w:r>
-            <w:r>
-              <w:rPr>
-                <w:noProof/>
-                <w:webHidden/>
-              </w:rPr>
               <w:fldChar w:fldCharType="begin"/>
-            </w:r>
-            <w:r>
-              <w:rPr>
-                <w:noProof/>
-                <w:webHidden/>
-              </w:rPr>
               <w:instrText xml:space="preserve"> PAGEREF _Toc233395654 \h </w:instrText>
-            </w:r>
-            <w:r>
-              <w:rPr>
-                <w:noProof/>
-                <w:webHidden/>
-              </w:rPr>
-            </w:r>
-            <w:r>
-              <w:rPr>
-                <w:noProof/>
-                <w:webHidden/>
-              </w:rPr>
               <w:fldChar w:fldCharType="separate"/>
-            </w:r>
-            <w:r>
-              <w:rPr>
-                <w:noProof/>
-                <w:webHidden/>
-              </w:rPr>
               <w:t>3</w:t>
-            </w:r>
-            <w:r>
-              <w:rPr>
-                <w:noProof/>
-                <w:webHidden/>
-              </w:rPr>
               <w:fldChar w:fldCharType="end"/>
             </w:r>
           </w:hyperlink>
@@ -612,46 +539,10 @@
                 <w:webHidden/>
               </w:rPr>
               <w:tab/>
-            </w:r>
-            <w:r>
-              <w:rPr>
-                <w:noProof/>
-                <w:webHidden/>
-              </w:rPr>
               <w:fldChar w:fldCharType="begin"/>
-            </w:r>
-            <w:r>
-              <w:rPr>
-                <w:noProof/>
-                <w:webHidden/>
-              </w:rPr>
               <w:instrText xml:space="preserve"> PAGEREF _Toc233395655 \h </w:instrText>
-            </w:r>
-            <w:r>
-              <w:rPr>
-                <w:noProof/>
-                <w:webHidden/>
-              </w:rPr>
-            </w:r>
-            <w:r>
-              <w:rPr>
-                <w:noProof/>
-                <w:webHidden/>
-              </w:rPr>
               <w:fldChar w:fldCharType="separate"/>
-            </w:r>
-            <w:r>
-              <w:rPr>
-                <w:noProof/>
-                <w:webHidden/>
-              </w:rPr>
               <w:t>3</w:t>
-            </w:r>
-            <w:r>
-              <w:rPr>
-                <w:noProof/>
-                <w:webHidden/>
-              </w:rPr>
               <w:fldChar w:fldCharType="end"/>
             </w:r>
           </w:hyperlink>
@@ -686,46 +577,10 @@
                 <w:webHidden/>
               </w:rPr>
               <w:tab/>
-            </w:r>
-            <w:r>
-              <w:rPr>
-                <w:noProof/>
-                <w:webHidden/>
-              </w:rPr>
               <w:fldChar w:fldCharType="begin"/>
-            </w:r>
-            <w:r>
-              <w:rPr>
-                <w:noProof/>
-                <w:webHidden/>
-              </w:rPr>
               <w:instrText xml:space="preserve"> PAGEREF _Toc233395656 \h </w:instrText>
-            </w:r>
-            <w:r>
-              <w:rPr>
-                <w:noProof/>
-                <w:webHidden/>
-              </w:rPr>
-            </w:r>
-            <w:r>
-              <w:rPr>
-                <w:noProof/>
-                <w:webHidden/>
-              </w:rPr>
               <w:fldChar w:fldCharType="separate"/>
-            </w:r>
-            <w:r>
-              <w:rPr>
-                <w:noProof/>
-                <w:webHidden/>
-              </w:rPr>
               <w:t>3</w:t>
-            </w:r>
-            <w:r>
-              <w:rPr>
-                <w:noProof/>
-                <w:webHidden/>
-              </w:rPr>
               <w:fldChar w:fldCharType="end"/>
             </w:r>
           </w:hyperlink>
@@ -759,46 +614,10 @@
                 <w:webHidden/>
               </w:rPr>
               <w:tab/>
-            </w:r>
-            <w:r>
-              <w:rPr>
-                <w:noProof/>
-                <w:webHidden/>
-              </w:rPr>
               <w:fldChar w:fldCharType="begin"/>
-            </w:r>
-            <w:r>
-              <w:rPr>
-                <w:noProof/>
-                <w:webHidden/>
-              </w:rPr>
               <w:instrText xml:space="preserve"> PAGEREF _Toc233395657 \h </w:instrText>
-            </w:r>
-            <w:r>
-              <w:rPr>
-                <w:noProof/>
-                <w:webHidden/>
-              </w:rPr>
-            </w:r>
-            <w:r>
-              <w:rPr>
-                <w:noProof/>
-                <w:webHidden/>
-              </w:rPr>
               <w:fldChar w:fldCharType="separate"/>
-            </w:r>
-            <w:r>
-              <w:rPr>
-                <w:noProof/>
-                <w:webHidden/>
-              </w:rPr>
               <w:t>3</w:t>
-            </w:r>
-            <w:r>
-              <w:rPr>
-                <w:noProof/>
-                <w:webHidden/>
-              </w:rPr>
               <w:fldChar w:fldCharType="end"/>
             </w:r>
           </w:hyperlink>
@@ -832,46 +651,10 @@
                 <w:webHidden/>
               </w:rPr>
               <w:tab/>
-            </w:r>
-            <w:r>
-              <w:rPr>
-                <w:noProof/>
-                <w:webHidden/>
-              </w:rPr>
               <w:fldChar w:fldCharType="begin"/>
-            </w:r>
-            <w:r>
-              <w:rPr>
-                <w:noProof/>
-                <w:webHidden/>
-              </w:rPr>
               <w:instrText xml:space="preserve"> PAGEREF _Toc233395658 \h </w:instrText>
-            </w:r>
-            <w:r>
-              <w:rPr>
-                <w:noProof/>
-                <w:webHidden/>
-              </w:rPr>
-            </w:r>
-            <w:r>
-              <w:rPr>
-                <w:noProof/>
-                <w:webHidden/>
-              </w:rPr>
               <w:fldChar w:fldCharType="separate"/>
-            </w:r>
-            <w:r>
-              <w:rPr>
-                <w:noProof/>
-                <w:webHidden/>
-              </w:rPr>
               <w:t>4</w:t>
-            </w:r>
-            <w:r>
-              <w:rPr>
-                <w:noProof/>
-                <w:webHidden/>
-              </w:rPr>
               <w:fldChar w:fldCharType="end"/>
             </w:r>
           </w:hyperlink>
@@ -906,46 +689,10 @@
                 <w:webHidden/>
               </w:rPr>
               <w:tab/>
-            </w:r>
-            <w:r>
-              <w:rPr>
-                <w:noProof/>
-                <w:webHidden/>
-              </w:rPr>
               <w:fldChar w:fldCharType="begin"/>
-            </w:r>
-            <w:r>
-              <w:rPr>
-                <w:noProof/>
-                <w:webHidden/>
-              </w:rPr>
               <w:instrText xml:space="preserve"> PAGEREF _Toc233395659 \h </w:instrText>
-            </w:r>
-            <w:r>
-              <w:rPr>
-                <w:noProof/>
-                <w:webHidden/>
-              </w:rPr>
-            </w:r>
-            <w:r>
-              <w:rPr>
-                <w:noProof/>
-                <w:webHidden/>
-              </w:rPr>
               <w:fldChar w:fldCharType="separate"/>
-            </w:r>
-            <w:r>
-              <w:rPr>
-                <w:noProof/>
-                <w:webHidden/>
-              </w:rPr>
               <w:t>4</w:t>
-            </w:r>
-            <w:r>
-              <w:rPr>
-                <w:noProof/>
-                <w:webHidden/>
-              </w:rPr>
               <w:fldChar w:fldCharType="end"/>
             </w:r>
           </w:hyperlink>
@@ -980,46 +727,10 @@
                 <w:webHidden/>
               </w:rPr>
               <w:tab/>
-            </w:r>
-            <w:r>
-              <w:rPr>
-                <w:noProof/>
-                <w:webHidden/>
-              </w:rPr>
               <w:fldChar w:fldCharType="begin"/>
-            </w:r>
-            <w:r>
-              <w:rPr>
-                <w:noProof/>
-                <w:webHidden/>
-              </w:rPr>
               <w:instrText xml:space="preserve"> PAGEREF _Toc233395660 \h </w:instrText>
-            </w:r>
-            <w:r>
-              <w:rPr>
-                <w:noProof/>
-                <w:webHidden/>
-              </w:rPr>
-            </w:r>
-            <w:r>
-              <w:rPr>
-                <w:noProof/>
-                <w:webHidden/>
-              </w:rPr>
               <w:fldChar w:fldCharType="separate"/>
-            </w:r>
-            <w:r>
-              <w:rPr>
-                <w:noProof/>
-                <w:webHidden/>
-              </w:rPr>
               <w:t>5</w:t>
-            </w:r>
-            <w:r>
-              <w:rPr>
-                <w:noProof/>
-                <w:webHidden/>
-              </w:rPr>
               <w:fldChar w:fldCharType="end"/>
             </w:r>
           </w:hyperlink>
@@ -1054,46 +765,10 @@
                 <w:webHidden/>
               </w:rPr>
               <w:tab/>
-            </w:r>
-            <w:r>
-              <w:rPr>
-                <w:noProof/>
-                <w:webHidden/>
-              </w:rPr>
               <w:fldChar w:fldCharType="begin"/>
-            </w:r>
-            <w:r>
-              <w:rPr>
-                <w:noProof/>
-                <w:webHidden/>
-              </w:rPr>
               <w:instrText xml:space="preserve"> PAGEREF _Toc233395661 \h </w:instrText>
-            </w:r>
-            <w:r>
-              <w:rPr>
-                <w:noProof/>
-                <w:webHidden/>
-              </w:rPr>
-            </w:r>
-            <w:r>
-              <w:rPr>
-                <w:noProof/>
-                <w:webHidden/>
-              </w:rPr>
               <w:fldChar w:fldCharType="separate"/>
-            </w:r>
-            <w:r>
-              <w:rPr>
-                <w:noProof/>
-                <w:webHidden/>
-              </w:rPr>
               <w:t>5</w:t>
-            </w:r>
-            <w:r>
-              <w:rPr>
-                <w:noProof/>
-                <w:webHidden/>
-              </w:rPr>
               <w:fldChar w:fldCharType="end"/>
             </w:r>
           </w:hyperlink>
@@ -1128,46 +803,10 @@
                 <w:webHidden/>
               </w:rPr>
               <w:tab/>
-            </w:r>
-            <w:r>
-              <w:rPr>
-                <w:noProof/>
-                <w:webHidden/>
-              </w:rPr>
               <w:fldChar w:fldCharType="begin"/>
-            </w:r>
-            <w:r>
-              <w:rPr>
-                <w:noProof/>
-                <w:webHidden/>
-              </w:rPr>
               <w:instrText xml:space="preserve"> PAGEREF _Toc233395662 \h </w:instrText>
-            </w:r>
-            <w:r>
-              <w:rPr>
-                <w:noProof/>
-                <w:webHidden/>
-              </w:rPr>
-            </w:r>
-            <w:r>
-              <w:rPr>
-                <w:noProof/>
-                <w:webHidden/>
-              </w:rPr>
               <w:fldChar w:fldCharType="separate"/>
-            </w:r>
-            <w:r>
-              <w:rPr>
-                <w:noProof/>
-                <w:webHidden/>
-              </w:rPr>
               <w:t>6</w:t>
-            </w:r>
-            <w:r>
-              <w:rPr>
-                <w:noProof/>
-                <w:webHidden/>
-              </w:rPr>
               <w:fldChar w:fldCharType="end"/>
             </w:r>
           </w:hyperlink>
@@ -1201,46 +840,10 @@
                 <w:webHidden/>
               </w:rPr>
               <w:tab/>
-            </w:r>
-            <w:r>
-              <w:rPr>
-                <w:noProof/>
-                <w:webHidden/>
-              </w:rPr>
               <w:fldChar w:fldCharType="begin"/>
-            </w:r>
-            <w:r>
-              <w:rPr>
-                <w:noProof/>
-                <w:webHidden/>
-              </w:rPr>
               <w:instrText xml:space="preserve"> PAGEREF _Toc233395663 \h </w:instrText>
-            </w:r>
-            <w:r>
-              <w:rPr>
-                <w:noProof/>
-                <w:webHidden/>
-              </w:rPr>
-            </w:r>
-            <w:r>
-              <w:rPr>
-                <w:noProof/>
-                <w:webHidden/>
-              </w:rPr>
               <w:fldChar w:fldCharType="separate"/>
-            </w:r>
-            <w:r>
-              <w:rPr>
-                <w:noProof/>
-                <w:webHidden/>
-              </w:rPr>
               <w:t>6</w:t>
-            </w:r>
-            <w:r>
-              <w:rPr>
-                <w:noProof/>
-                <w:webHidden/>
-              </w:rPr>
               <w:fldChar w:fldCharType="end"/>
             </w:r>
           </w:hyperlink>
@@ -1274,46 +877,10 @@
                 <w:webHidden/>
               </w:rPr>
               <w:tab/>
-            </w:r>
-            <w:r>
-              <w:rPr>
-                <w:noProof/>
-                <w:webHidden/>
-              </w:rPr>
               <w:fldChar w:fldCharType="begin"/>
-            </w:r>
-            <w:r>
-              <w:rPr>
-                <w:noProof/>
-                <w:webHidden/>
-              </w:rPr>
               <w:instrText xml:space="preserve"> PAGEREF _Toc233395664 \h </w:instrText>
-            </w:r>
-            <w:r>
-              <w:rPr>
-                <w:noProof/>
-                <w:webHidden/>
-              </w:rPr>
-            </w:r>
-            <w:r>
-              <w:rPr>
-                <w:noProof/>
-                <w:webHidden/>
-              </w:rPr>
               <w:fldChar w:fldCharType="separate"/>
-            </w:r>
-            <w:r>
-              <w:rPr>
-                <w:noProof/>
-                <w:webHidden/>
-              </w:rPr>
               <w:t>6</w:t>
-            </w:r>
-            <w:r>
-              <w:rPr>
-                <w:noProof/>
-                <w:webHidden/>
-              </w:rPr>
               <w:fldChar w:fldCharType="end"/>
             </w:r>
           </w:hyperlink>
@@ -1364,7 +931,7 @@
         <w:rPr>
           <w:lang w:val="en-NZ"/>
         </w:rPr>
-        <w:t>This document and the accompanying repository were produced as a time-boxed technical-interview assignment for Progile — a frontend challenge — rather than as a production product. The objective was to implement a reusable Newsletter Subscription component for a TinaCMS-powered site and to document the reasoning behind each decision.</w:t>
+        <w:t>This document and the accompanying repository were produced as a time-boxed technical-interview assignment for TestResults — a frontend challenge — rather than as a production product. The objective was to implement a reusable Newsletter Subscription component for a TinaCMS-powered site and to document the reasoning behind each decision.</w:t>
       </w:r>
     </w:p>
     <w:p>
@@ -1815,14 +1382,9 @@
         <w:pStyle w:val="Ttulo2"/>
       </w:pPr>
       <w:r>
-        <w:t xml:space="preserve">Editable </w:t>
-      </w:r>
-      <w:proofErr w:type="spellStart"/>
-      <w:r>
-        <w:t>fields</w:t>
+        <w:t>Editable fields</w:t>
       </w:r>
       <w:bookmarkEnd w:id="3"/>
-      <w:proofErr w:type="spellEnd"/>
     </w:p>
     <w:tbl>
       <w:tblPr>
@@ -2052,7 +1614,6 @@
             </w:tcMar>
           </w:tcPr>
           <w:p>
-            <w:proofErr w:type="spellStart"/>
             <w:r>
               <w:rPr>
                 <w:color w:val="0A0A0A"/>
@@ -2061,7 +1622,6 @@
               </w:rPr>
               <w:t>subheading</w:t>
             </w:r>
-            <w:proofErr w:type="spellEnd"/>
           </w:p>
         </w:tc>
         <w:tc>
@@ -2490,7 +2050,6 @@
             </w:tcMar>
           </w:tcPr>
           <w:p>
-            <w:proofErr w:type="spellStart"/>
             <w:r>
               <w:rPr>
                 <w:color w:val="0A0A0A"/>
@@ -2499,7 +2058,6 @@
               </w:rPr>
               <w:t>errorMessage</w:t>
             </w:r>
-            <w:proofErr w:type="spellEnd"/>
           </w:p>
         </w:tc>
         <w:tc>
@@ -2584,7 +2142,6 @@
             </w:tcMar>
           </w:tcPr>
           <w:p>
-            <w:proofErr w:type="spellStart"/>
             <w:r>
               <w:rPr>
                 <w:color w:val="0A0A0A"/>
@@ -2593,7 +2150,6 @@
               </w:rPr>
               <w:t>background</w:t>
             </w:r>
-            <w:proofErr w:type="spellEnd"/>
           </w:p>
         </w:tc>
         <w:tc>
@@ -3048,7 +2604,6 @@
             </w:tcMar>
           </w:tcPr>
           <w:p>
-            <w:proofErr w:type="spellStart"/>
             <w:r>
               <w:rPr>
                 <w:color w:val="0A0A0A"/>
@@ -3057,7 +2612,6 @@
               </w:rPr>
               <w:t>Styling</w:t>
             </w:r>
-            <w:proofErr w:type="spellEnd"/>
           </w:p>
         </w:tc>
         <w:tc>
@@ -3154,18 +2708,8 @@
                 <w:sz w:val="20"/>
                 <w:szCs w:val="20"/>
               </w:rPr>
-              <w:t xml:space="preserve">Schema </w:t>
-            </w:r>
-            <w:proofErr w:type="spellStart"/>
-            <w:r>
-              <w:rPr>
-                <w:color w:val="0A0A0A"/>
-                <w:sz w:val="20"/>
-                <w:szCs w:val="20"/>
-              </w:rPr>
-              <w:t>location</w:t>
-            </w:r>
-            <w:proofErr w:type="spellEnd"/>
+              <w:t>Schema location</w:t>
+            </w:r>
           </w:p>
         </w:tc>
         <w:tc>
@@ -3262,36 +2806,8 @@
                 <w:sz w:val="20"/>
                 <w:szCs w:val="20"/>
               </w:rPr>
-              <w:t xml:space="preserve">Rich-text </w:t>
-            </w:r>
-            <w:proofErr w:type="spellStart"/>
-            <w:r>
-              <w:rPr>
-                <w:color w:val="0A0A0A"/>
-                <w:sz w:val="20"/>
-                <w:szCs w:val="20"/>
-              </w:rPr>
-              <w:t>field</w:t>
-            </w:r>
-            <w:proofErr w:type="spellEnd"/>
-            <w:r>
-              <w:rPr>
-                <w:color w:val="0A0A0A"/>
-                <w:sz w:val="20"/>
-                <w:szCs w:val="20"/>
-              </w:rPr>
-              <w:t xml:space="preserve"> </w:t>
-            </w:r>
-            <w:proofErr w:type="spellStart"/>
-            <w:r>
-              <w:rPr>
-                <w:color w:val="0A0A0A"/>
-                <w:sz w:val="20"/>
-                <w:szCs w:val="20"/>
-              </w:rPr>
-              <w:t>names</w:t>
-            </w:r>
-            <w:proofErr w:type="spellEnd"/>
+              <w:t>Rich-text field names</w:t>
+            </w:r>
           </w:p>
         </w:tc>
         <w:tc>
@@ -3359,14 +2875,6 @@
                 <w:lang w:val="en-NZ"/>
               </w:rPr>
               <w:t xml:space="preserve">Unique names — other blocks define title/description as String; reusing a name with a </w:t>
-            </w:r>
-            <w:r>
-              <w:rPr>
-                <w:color w:val="0A0A0A"/>
-                <w:sz w:val="20"/>
-                <w:szCs w:val="20"/>
-                <w:lang w:val="en-NZ"/>
-              </w:rPr>
               <w:lastRenderedPageBreak/>
               <w:t>JSON (rich-text) type breaks the generated GraphQL fragment for the block union.</w:t>
             </w:r>
@@ -3392,7 +2900,6 @@
             </w:tcMar>
           </w:tcPr>
           <w:p>
-            <w:proofErr w:type="spellStart"/>
             <w:r>
               <w:rPr>
                 <w:color w:val="0A0A0A"/>
@@ -3402,7 +2909,6 @@
               <w:lastRenderedPageBreak/>
               <w:t>Highlight</w:t>
             </w:r>
-            <w:proofErr w:type="spellEnd"/>
           </w:p>
         </w:tc>
         <w:tc>
@@ -3597,18 +3103,8 @@
                 <w:sz w:val="20"/>
                 <w:szCs w:val="20"/>
               </w:rPr>
-              <w:t xml:space="preserve">Email </w:t>
-            </w:r>
-            <w:proofErr w:type="spellStart"/>
-            <w:r>
-              <w:rPr>
-                <w:color w:val="0A0A0A"/>
-                <w:sz w:val="20"/>
-                <w:szCs w:val="20"/>
-              </w:rPr>
-              <w:t>handling</w:t>
-            </w:r>
-            <w:proofErr w:type="spellEnd"/>
+              <w:t>Email handling</w:t>
+            </w:r>
           </w:p>
         </w:tc>
         <w:tc>
@@ -3699,34 +3195,14 @@
             </w:tcMar>
           </w:tcPr>
           <w:p>
-            <w:proofErr w:type="spellStart"/>
-            <w:r>
-              <w:rPr>
-                <w:color w:val="0A0A0A"/>
-                <w:sz w:val="20"/>
-                <w:szCs w:val="20"/>
-              </w:rPr>
-              <w:t>Node</w:t>
-            </w:r>
-            <w:proofErr w:type="spellEnd"/>
-            <w:r>
-              <w:rPr>
-                <w:color w:val="0A0A0A"/>
-                <w:sz w:val="20"/>
-                <w:szCs w:val="20"/>
-              </w:rPr>
-              <w:t xml:space="preserve"> </w:t>
-            </w:r>
-            <w:proofErr w:type="spellStart"/>
-            <w:r>
-              <w:rPr>
-                <w:color w:val="0A0A0A"/>
-                <w:sz w:val="20"/>
-                <w:szCs w:val="20"/>
-              </w:rPr>
-              <w:t>version</w:t>
-            </w:r>
-            <w:proofErr w:type="spellEnd"/>
+            <w:r>
+              <w:rPr>
+                <w:color w:val="0A0A0A"/>
+                <w:sz w:val="20"/>
+                <w:szCs w:val="20"/>
+              </w:rPr>
+              <w:t>Node version</w:t>
+            </w:r>
           </w:p>
         </w:tc>
         <w:tc>
@@ -3817,18 +3293,8 @@
                 <w:sz w:val="20"/>
                 <w:szCs w:val="20"/>
               </w:rPr>
-              <w:t xml:space="preserve">Editor </w:t>
-            </w:r>
-            <w:proofErr w:type="spellStart"/>
-            <w:r>
-              <w:rPr>
-                <w:color w:val="0A0A0A"/>
-                <w:sz w:val="20"/>
-                <w:szCs w:val="20"/>
-              </w:rPr>
-              <w:t>backend</w:t>
-            </w:r>
-            <w:proofErr w:type="spellEnd"/>
+              <w:t>Editor backend</w:t>
+            </w:r>
           </w:p>
         </w:tc>
         <w:tc>
@@ -4575,61 +4041,7 @@
         <w:sz w:val="16"/>
         <w:szCs w:val="16"/>
       </w:rPr>
-      <w:t xml:space="preserve">5ergioC · </w:t>
-    </w:r>
-    <w:proofErr w:type="spellStart"/>
-    <w:r>
-      <w:rPr>
-        <w:color w:val="555555"/>
-        <w:sz w:val="16"/>
-        <w:szCs w:val="16"/>
-      </w:rPr>
-      <w:t>Newsletter</w:t>
-    </w:r>
-    <w:proofErr w:type="spellEnd"/>
-    <w:r>
-      <w:rPr>
-        <w:color w:val="555555"/>
-        <w:sz w:val="16"/>
-        <w:szCs w:val="16"/>
-      </w:rPr>
-      <w:t xml:space="preserve"> </w:t>
-    </w:r>
-    <w:proofErr w:type="spellStart"/>
-    <w:r>
-      <w:rPr>
-        <w:color w:val="555555"/>
-        <w:sz w:val="16"/>
-        <w:szCs w:val="16"/>
-      </w:rPr>
-      <w:t>Subscription</w:t>
-    </w:r>
-    <w:proofErr w:type="spellEnd"/>
-    <w:r>
-      <w:rPr>
-        <w:color w:val="555555"/>
-        <w:sz w:val="16"/>
-        <w:szCs w:val="16"/>
-      </w:rPr>
-      <w:t xml:space="preserve"> </w:t>
-    </w:r>
-    <w:proofErr w:type="spellStart"/>
-    <w:r>
-      <w:rPr>
-        <w:color w:val="555555"/>
-        <w:sz w:val="16"/>
-        <w:szCs w:val="16"/>
-      </w:rPr>
-      <w:t>Component</w:t>
-    </w:r>
-    <w:proofErr w:type="spellEnd"/>
-    <w:r>
-      <w:rPr>
-        <w:color w:val="555555"/>
-        <w:sz w:val="16"/>
-        <w:szCs w:val="16"/>
-      </w:rPr>
-      <w:t xml:space="preserve"> · Page </w:t>
+      <w:t xml:space="preserve">5ergioC · Newsletter Subscription Component · Page </w:t>
     </w:r>
     <w:r>
       <w:rPr>

</xml_diff>